<commit_message>
Bake page numbers into the contents page, and ship a PDF
The contents page was a Word TOC field, which renders as an empty box or a
'right-click to update' prompt in anything that is not Microsoft Word — a
browser, a phone, Google Docs. Page numbers are now captured from a real
pagination pass and written as static text with dot leaders, so the contents
page is correct wherever the document is opened.

Also exports a PDF alongside the .docx, so the document is readable without
Word at all.

Co-Authored-By: Claude Opus 5 <noreply@anthropic.com>
</commit_message>
<xml_diff>
--- a/Hari-R_127156127_Distributed-Job-Scheduler.docx
+++ b/Hari-R_127156127_Distributed-Job-Scheduler.docx
@@ -526,54 +526,2002 @@
         <w:t xml:space="preserve">Contents</w:t>
       </w:r>
     </w:p>
-    <w:sdt>
-      <w:sdtPr>
-        <w:alias w:val="Contents"/>
-      </w:sdtPr>
-      <w:sdtContent>
-        <w:p>
-          <w:r>
-            <w:fldChar w:fldCharType="begin" w:dirty="true"/>
-            <w:instrText xml:space="preserve">TOC \h \o "1-2"</w:instrText>
-            <w:fldChar w:fldCharType="separate"/>
-          </w:r>
-        </w:p>
-        <w:p>
-          <w:r>
-            <w:fldChar w:fldCharType="end"/>
-          </w:r>
-        </w:p>
-      </w:sdtContent>
-    </w:sdt>
-    <w:p>
-      <w:pPr>
-        <w:pBdr>
-          <w:left w:val="single" w:color="0F766E" w:sz="18" w:space="12"/>
-        </w:pBdr>
-        <w:spacing w:after="180" w:before="120" w:line="276"/>
-        <w:ind w:left="200"/>
+    <w:p>
+      <w:pPr>
+        <w:spacing w:after="60" w:line="264"/>
+        <w:ind w:left="0"/>
       </w:pPr>
       <w:r>
         <w:rPr>
           <w:rFonts w:ascii="Calibri" w:cs="Calibri" w:eastAsia="Calibri" w:hAnsi="Calibri"/>
           <w:b/>
           <w:bCs/>
-          <w:color w:val="0F766E"/>
-          <w:sz w:val="20"/>
-          <w:szCs w:val="20"/>
-        </w:rPr>
-        <w:t xml:space="preserve">In Word — </w:t>
-      </w:r>
-      <w:r>
-        <w:rPr>
-          <w:rFonts w:ascii="Calibri" w:cs="Calibri" w:eastAsia="Calibri" w:hAnsi="Calibri"/>
-          <w:i/>
-          <w:iCs/>
+          <w:color w:val="1A1A1A"/>
+          <w:sz w:val="21"/>
+          <w:szCs w:val="21"/>
+        </w:rPr>
+        <w:t xml:space="preserve">Deliverables</w:t>
+      </w:r>
+      <w:r>
+        <w:rPr>
+          <w:rFonts w:ascii="Calibri" w:cs="Calibri" w:eastAsia="Calibri" w:hAnsi="Calibri"/>
+          <w:color w:val="1A1A1A"/>
+          <w:sz w:val="21"/>
+          <w:szCs w:val="21"/>
+        </w:rPr>
+        <w:ptab w:alignment="right" w:relativeTo="margin" w:leader="dot"/>
+      </w:r>
+      <w:r>
+        <w:rPr>
+          <w:rFonts w:ascii="Calibri" w:cs="Calibri" w:eastAsia="Calibri" w:hAnsi="Calibri"/>
+          <w:b/>
+          <w:bCs/>
+          <w:color w:val="1A1A1A"/>
+          <w:sz w:val="21"/>
+          <w:szCs w:val="21"/>
+        </w:rPr>
+        <w:t xml:space="preserve">4</w:t>
+      </w:r>
+    </w:p>
+    <w:p>
+      <w:pPr>
+        <w:spacing w:after="30" w:line="264"/>
+        <w:ind w:left="300"/>
+      </w:pPr>
+      <w:r>
+        <w:rPr>
+          <w:rFonts w:ascii="Calibri" w:cs="Calibri" w:eastAsia="Calibri" w:hAnsi="Calibri"/>
+          <w:b w:val="false"/>
+          <w:bCs w:val="false"/>
           <w:color w:val="5A6072"/>
-          <w:sz w:val="20"/>
-          <w:szCs w:val="20"/>
-        </w:rPr>
-        <w:t xml:space="preserve">Right-click the table above and choose "Update Field" to populate page numbers.</w:t>
+          <w:sz w:val="19"/>
+          <w:szCs w:val="19"/>
+        </w:rPr>
+        <w:t xml:space="preserve">Evaluating it in five minutes</w:t>
+      </w:r>
+      <w:r>
+        <w:rPr>
+          <w:rFonts w:ascii="Calibri" w:cs="Calibri" w:eastAsia="Calibri" w:hAnsi="Calibri"/>
+          <w:color w:val="5A6072"/>
+          <w:sz w:val="19"/>
+          <w:szCs w:val="19"/>
+        </w:rPr>
+        <w:ptab w:alignment="right" w:relativeTo="margin" w:leader="dot"/>
+      </w:r>
+      <w:r>
+        <w:rPr>
+          <w:rFonts w:ascii="Calibri" w:cs="Calibri" w:eastAsia="Calibri" w:hAnsi="Calibri"/>
+          <w:b w:val="false"/>
+          <w:bCs w:val="false"/>
+          <w:color w:val="5A6072"/>
+          <w:sz w:val="19"/>
+          <w:szCs w:val="19"/>
+        </w:rPr>
+        <w:t xml:space="preserve">4</w:t>
+      </w:r>
+    </w:p>
+    <w:p>
+      <w:pPr>
+        <w:spacing w:after="60" w:line="264"/>
+        <w:ind w:left="0"/>
+      </w:pPr>
+      <w:r>
+        <w:rPr>
+          <w:rFonts w:ascii="Calibri" w:cs="Calibri" w:eastAsia="Calibri" w:hAnsi="Calibri"/>
+          <w:b/>
+          <w:bCs/>
+          <w:color w:val="1A1A1A"/>
+          <w:sz w:val="21"/>
+          <w:szCs w:val="21"/>
+        </w:rPr>
+        <w:t xml:space="preserve">1.  Executive summary</w:t>
+      </w:r>
+      <w:r>
+        <w:rPr>
+          <w:rFonts w:ascii="Calibri" w:cs="Calibri" w:eastAsia="Calibri" w:hAnsi="Calibri"/>
+          <w:color w:val="1A1A1A"/>
+          <w:sz w:val="21"/>
+          <w:szCs w:val="21"/>
+        </w:rPr>
+        <w:ptab w:alignment="right" w:relativeTo="margin" w:leader="dot"/>
+      </w:r>
+      <w:r>
+        <w:rPr>
+          <w:rFonts w:ascii="Calibri" w:cs="Calibri" w:eastAsia="Calibri" w:hAnsi="Calibri"/>
+          <w:b/>
+          <w:bCs/>
+          <w:color w:val="1A1A1A"/>
+          <w:sz w:val="21"/>
+          <w:szCs w:val="21"/>
+        </w:rPr>
+        <w:t xml:space="preserve">5</w:t>
+      </w:r>
+    </w:p>
+    <w:p>
+      <w:pPr>
+        <w:spacing w:after="30" w:line="264"/>
+        <w:ind w:left="300"/>
+      </w:pPr>
+      <w:r>
+        <w:rPr>
+          <w:rFonts w:ascii="Calibri" w:cs="Calibri" w:eastAsia="Calibri" w:hAnsi="Calibri"/>
+          <w:b w:val="false"/>
+          <w:bCs w:val="false"/>
+          <w:color w:val="5A6072"/>
+          <w:sz w:val="19"/>
+          <w:szCs w:val="19"/>
+        </w:rPr>
+        <w:t xml:space="preserve">1.1  The problem, precisely</w:t>
+      </w:r>
+      <w:r>
+        <w:rPr>
+          <w:rFonts w:ascii="Calibri" w:cs="Calibri" w:eastAsia="Calibri" w:hAnsi="Calibri"/>
+          <w:color w:val="5A6072"/>
+          <w:sz w:val="19"/>
+          <w:szCs w:val="19"/>
+        </w:rPr>
+        <w:ptab w:alignment="right" w:relativeTo="margin" w:leader="dot"/>
+      </w:r>
+      <w:r>
+        <w:rPr>
+          <w:rFonts w:ascii="Calibri" w:cs="Calibri" w:eastAsia="Calibri" w:hAnsi="Calibri"/>
+          <w:b w:val="false"/>
+          <w:bCs w:val="false"/>
+          <w:color w:val="5A6072"/>
+          <w:sz w:val="19"/>
+          <w:szCs w:val="19"/>
+        </w:rPr>
+        <w:t xml:space="preserve">5</w:t>
+      </w:r>
+    </w:p>
+    <w:p>
+      <w:pPr>
+        <w:spacing w:after="30" w:line="264"/>
+        <w:ind w:left="300"/>
+      </w:pPr>
+      <w:r>
+        <w:rPr>
+          <w:rFonts w:ascii="Calibri" w:cs="Calibri" w:eastAsia="Calibri" w:hAnsi="Calibri"/>
+          <w:b w:val="false"/>
+          <w:bCs w:val="false"/>
+          <w:color w:val="5A6072"/>
+          <w:sz w:val="19"/>
+          <w:szCs w:val="19"/>
+        </w:rPr>
+        <w:t xml:space="preserve">1.2  The governing design decision</w:t>
+      </w:r>
+      <w:r>
+        <w:rPr>
+          <w:rFonts w:ascii="Calibri" w:cs="Calibri" w:eastAsia="Calibri" w:hAnsi="Calibri"/>
+          <w:color w:val="5A6072"/>
+          <w:sz w:val="19"/>
+          <w:szCs w:val="19"/>
+        </w:rPr>
+        <w:ptab w:alignment="right" w:relativeTo="margin" w:leader="dot"/>
+      </w:r>
+      <w:r>
+        <w:rPr>
+          <w:rFonts w:ascii="Calibri" w:cs="Calibri" w:eastAsia="Calibri" w:hAnsi="Calibri"/>
+          <w:b w:val="false"/>
+          <w:bCs w:val="false"/>
+          <w:color w:val="5A6072"/>
+          <w:sz w:val="19"/>
+          <w:szCs w:val="19"/>
+        </w:rPr>
+        <w:t xml:space="preserve">5</w:t>
+      </w:r>
+    </w:p>
+    <w:p>
+      <w:pPr>
+        <w:spacing w:after="30" w:line="264"/>
+        <w:ind w:left="300"/>
+      </w:pPr>
+      <w:r>
+        <w:rPr>
+          <w:rFonts w:ascii="Calibri" w:cs="Calibri" w:eastAsia="Calibri" w:hAnsi="Calibri"/>
+          <w:b w:val="false"/>
+          <w:bCs w:val="false"/>
+          <w:color w:val="5A6072"/>
+          <w:sz w:val="19"/>
+          <w:szCs w:val="19"/>
+        </w:rPr>
+        <w:t xml:space="preserve">1.3  What was built</w:t>
+      </w:r>
+      <w:r>
+        <w:rPr>
+          <w:rFonts w:ascii="Calibri" w:cs="Calibri" w:eastAsia="Calibri" w:hAnsi="Calibri"/>
+          <w:color w:val="5A6072"/>
+          <w:sz w:val="19"/>
+          <w:szCs w:val="19"/>
+        </w:rPr>
+        <w:ptab w:alignment="right" w:relativeTo="margin" w:leader="dot"/>
+      </w:r>
+      <w:r>
+        <w:rPr>
+          <w:rFonts w:ascii="Calibri" w:cs="Calibri" w:eastAsia="Calibri" w:hAnsi="Calibri"/>
+          <w:b w:val="false"/>
+          <w:bCs w:val="false"/>
+          <w:color w:val="5A6072"/>
+          <w:sz w:val="19"/>
+          <w:szCs w:val="19"/>
+        </w:rPr>
+        <w:t xml:space="preserve">5</w:t>
+      </w:r>
+    </w:p>
+    <w:p>
+      <w:pPr>
+        <w:spacing w:after="60" w:line="264"/>
+        <w:ind w:left="0"/>
+      </w:pPr>
+      <w:r>
+        <w:rPr>
+          <w:rFonts w:ascii="Calibri" w:cs="Calibri" w:eastAsia="Calibri" w:hAnsi="Calibri"/>
+          <w:b/>
+          <w:bCs/>
+          <w:color w:val="1A1A1A"/>
+          <w:sz w:val="21"/>
+          <w:szCs w:val="21"/>
+        </w:rPr>
+        <w:t xml:space="preserve">2.  System architecture</w:t>
+      </w:r>
+      <w:r>
+        <w:rPr>
+          <w:rFonts w:ascii="Calibri" w:cs="Calibri" w:eastAsia="Calibri" w:hAnsi="Calibri"/>
+          <w:color w:val="1A1A1A"/>
+          <w:sz w:val="21"/>
+          <w:szCs w:val="21"/>
+        </w:rPr>
+        <w:ptab w:alignment="right" w:relativeTo="margin" w:leader="dot"/>
+      </w:r>
+      <w:r>
+        <w:rPr>
+          <w:rFonts w:ascii="Calibri" w:cs="Calibri" w:eastAsia="Calibri" w:hAnsi="Calibri"/>
+          <w:b/>
+          <w:bCs/>
+          <w:color w:val="1A1A1A"/>
+          <w:sz w:val="21"/>
+          <w:szCs w:val="21"/>
+        </w:rPr>
+        <w:t xml:space="preserve">6</w:t>
+      </w:r>
+    </w:p>
+    <w:p>
+      <w:pPr>
+        <w:spacing w:after="30" w:line="264"/>
+        <w:ind w:left="300"/>
+      </w:pPr>
+      <w:r>
+        <w:rPr>
+          <w:rFonts w:ascii="Calibri" w:cs="Calibri" w:eastAsia="Calibri" w:hAnsi="Calibri"/>
+          <w:b w:val="false"/>
+          <w:bCs w:val="false"/>
+          <w:color w:val="5A6072"/>
+          <w:sz w:val="19"/>
+          <w:szCs w:val="19"/>
+        </w:rPr>
+        <w:t xml:space="preserve">2.1  Why a modular monolith, and one genuine split</w:t>
+      </w:r>
+      <w:r>
+        <w:rPr>
+          <w:rFonts w:ascii="Calibri" w:cs="Calibri" w:eastAsia="Calibri" w:hAnsi="Calibri"/>
+          <w:color w:val="5A6072"/>
+          <w:sz w:val="19"/>
+          <w:szCs w:val="19"/>
+        </w:rPr>
+        <w:ptab w:alignment="right" w:relativeTo="margin" w:leader="dot"/>
+      </w:r>
+      <w:r>
+        <w:rPr>
+          <w:rFonts w:ascii="Calibri" w:cs="Calibri" w:eastAsia="Calibri" w:hAnsi="Calibri"/>
+          <w:b w:val="false"/>
+          <w:bCs w:val="false"/>
+          <w:color w:val="5A6072"/>
+          <w:sz w:val="19"/>
+          <w:szCs w:val="19"/>
+        </w:rPr>
+        <w:t xml:space="preserve">6</w:t>
+      </w:r>
+    </w:p>
+    <w:p>
+      <w:pPr>
+        <w:spacing w:after="30" w:line="264"/>
+        <w:ind w:left="300"/>
+      </w:pPr>
+      <w:r>
+        <w:rPr>
+          <w:rFonts w:ascii="Calibri" w:cs="Calibri" w:eastAsia="Calibri" w:hAnsi="Calibri"/>
+          <w:b w:val="false"/>
+          <w:bCs w:val="false"/>
+          <w:color w:val="5A6072"/>
+          <w:sz w:val="19"/>
+          <w:szCs w:val="19"/>
+        </w:rPr>
+        <w:t xml:space="preserve">2.2  Leader election, and why it is structural</w:t>
+      </w:r>
+      <w:r>
+        <w:rPr>
+          <w:rFonts w:ascii="Calibri" w:cs="Calibri" w:eastAsia="Calibri" w:hAnsi="Calibri"/>
+          <w:color w:val="5A6072"/>
+          <w:sz w:val="19"/>
+          <w:szCs w:val="19"/>
+        </w:rPr>
+        <w:ptab w:alignment="right" w:relativeTo="margin" w:leader="dot"/>
+      </w:r>
+      <w:r>
+        <w:rPr>
+          <w:rFonts w:ascii="Calibri" w:cs="Calibri" w:eastAsia="Calibri" w:hAnsi="Calibri"/>
+          <w:b w:val="false"/>
+          <w:bCs w:val="false"/>
+          <w:color w:val="5A6072"/>
+          <w:sz w:val="19"/>
+          <w:szCs w:val="19"/>
+        </w:rPr>
+        <w:t xml:space="preserve">6</w:t>
+      </w:r>
+    </w:p>
+    <w:p>
+      <w:pPr>
+        <w:spacing w:after="30" w:line="264"/>
+        <w:ind w:left="300"/>
+      </w:pPr>
+      <w:r>
+        <w:rPr>
+          <w:rFonts w:ascii="Calibri" w:cs="Calibri" w:eastAsia="Calibri" w:hAnsi="Calibri"/>
+          <w:b w:val="false"/>
+          <w:bCs w:val="false"/>
+          <w:color w:val="5A6072"/>
+          <w:sz w:val="19"/>
+          <w:szCs w:val="19"/>
+        </w:rPr>
+        <w:t xml:space="preserve">2.3  Job discovery: push for latency, polling for correctness</w:t>
+      </w:r>
+      <w:r>
+        <w:rPr>
+          <w:rFonts w:ascii="Calibri" w:cs="Calibri" w:eastAsia="Calibri" w:hAnsi="Calibri"/>
+          <w:color w:val="5A6072"/>
+          <w:sz w:val="19"/>
+          <w:szCs w:val="19"/>
+        </w:rPr>
+        <w:ptab w:alignment="right" w:relativeTo="margin" w:leader="dot"/>
+      </w:r>
+      <w:r>
+        <w:rPr>
+          <w:rFonts w:ascii="Calibri" w:cs="Calibri" w:eastAsia="Calibri" w:hAnsi="Calibri"/>
+          <w:b w:val="false"/>
+          <w:bCs w:val="false"/>
+          <w:color w:val="5A6072"/>
+          <w:sz w:val="19"/>
+          <w:szCs w:val="19"/>
+        </w:rPr>
+        <w:t xml:space="preserve">6</w:t>
+      </w:r>
+    </w:p>
+    <w:p>
+      <w:pPr>
+        <w:spacing w:after="60" w:line="264"/>
+        <w:ind w:left="0"/>
+      </w:pPr>
+      <w:r>
+        <w:rPr>
+          <w:rFonts w:ascii="Calibri" w:cs="Calibri" w:eastAsia="Calibri" w:hAnsi="Calibri"/>
+          <w:b/>
+          <w:bCs/>
+          <w:color w:val="1A1A1A"/>
+          <w:sz w:val="21"/>
+          <w:szCs w:val="21"/>
+        </w:rPr>
+        <w:t xml:space="preserve">3.  Database design</w:t>
+      </w:r>
+      <w:r>
+        <w:rPr>
+          <w:rFonts w:ascii="Calibri" w:cs="Calibri" w:eastAsia="Calibri" w:hAnsi="Calibri"/>
+          <w:color w:val="1A1A1A"/>
+          <w:sz w:val="21"/>
+          <w:szCs w:val="21"/>
+        </w:rPr>
+        <w:ptab w:alignment="right" w:relativeTo="margin" w:leader="dot"/>
+      </w:r>
+      <w:r>
+        <w:rPr>
+          <w:rFonts w:ascii="Calibri" w:cs="Calibri" w:eastAsia="Calibri" w:hAnsi="Calibri"/>
+          <w:b/>
+          <w:bCs/>
+          <w:color w:val="1A1A1A"/>
+          <w:sz w:val="21"/>
+          <w:szCs w:val="21"/>
+        </w:rPr>
+        <w:t xml:space="preserve">8</w:t>
+      </w:r>
+    </w:p>
+    <w:p>
+      <w:pPr>
+        <w:spacing w:after="30" w:line="264"/>
+        <w:ind w:left="300"/>
+      </w:pPr>
+      <w:r>
+        <w:rPr>
+          <w:rFonts w:ascii="Calibri" w:cs="Calibri" w:eastAsia="Calibri" w:hAnsi="Calibri"/>
+          <w:b w:val="false"/>
+          <w:bCs w:val="false"/>
+          <w:color w:val="5A6072"/>
+          <w:sz w:val="19"/>
+          <w:szCs w:val="19"/>
+        </w:rPr>
+        <w:t xml:space="preserve">3.1  The split that matters most</w:t>
+      </w:r>
+      <w:r>
+        <w:rPr>
+          <w:rFonts w:ascii="Calibri" w:cs="Calibri" w:eastAsia="Calibri" w:hAnsi="Calibri"/>
+          <w:color w:val="5A6072"/>
+          <w:sz w:val="19"/>
+          <w:szCs w:val="19"/>
+        </w:rPr>
+        <w:ptab w:alignment="right" w:relativeTo="margin" w:leader="dot"/>
+      </w:r>
+      <w:r>
+        <w:rPr>
+          <w:rFonts w:ascii="Calibri" w:cs="Calibri" w:eastAsia="Calibri" w:hAnsi="Calibri"/>
+          <w:b w:val="false"/>
+          <w:bCs w:val="false"/>
+          <w:color w:val="5A6072"/>
+          <w:sz w:val="19"/>
+          <w:szCs w:val="19"/>
+        </w:rPr>
+        <w:t xml:space="preserve">8</w:t>
+      </w:r>
+    </w:p>
+    <w:p>
+      <w:pPr>
+        <w:spacing w:after="30" w:line="264"/>
+        <w:ind w:left="300"/>
+      </w:pPr>
+      <w:r>
+        <w:rPr>
+          <w:rFonts w:ascii="Calibri" w:cs="Calibri" w:eastAsia="Calibri" w:hAnsi="Calibri"/>
+          <w:b w:val="false"/>
+          <w:bCs w:val="false"/>
+          <w:color w:val="5A6072"/>
+          <w:sz w:val="19"/>
+          <w:szCs w:val="19"/>
+        </w:rPr>
+        <w:t xml:space="preserve">3.2  The claim index</w:t>
+      </w:r>
+      <w:r>
+        <w:rPr>
+          <w:rFonts w:ascii="Calibri" w:cs="Calibri" w:eastAsia="Calibri" w:hAnsi="Calibri"/>
+          <w:color w:val="5A6072"/>
+          <w:sz w:val="19"/>
+          <w:szCs w:val="19"/>
+        </w:rPr>
+        <w:ptab w:alignment="right" w:relativeTo="margin" w:leader="dot"/>
+      </w:r>
+      <w:r>
+        <w:rPr>
+          <w:rFonts w:ascii="Calibri" w:cs="Calibri" w:eastAsia="Calibri" w:hAnsi="Calibri"/>
+          <w:b w:val="false"/>
+          <w:bCs w:val="false"/>
+          <w:color w:val="5A6072"/>
+          <w:sz w:val="19"/>
+          <w:szCs w:val="19"/>
+        </w:rPr>
+        <w:t xml:space="preserve">9</w:t>
+      </w:r>
+    </w:p>
+    <w:p>
+      <w:pPr>
+        <w:spacing w:after="30" w:line="264"/>
+        <w:ind w:left="300"/>
+      </w:pPr>
+      <w:r>
+        <w:rPr>
+          <w:rFonts w:ascii="Calibri" w:cs="Calibri" w:eastAsia="Calibri" w:hAnsi="Calibri"/>
+          <w:b w:val="false"/>
+          <w:bCs w:val="false"/>
+          <w:color w:val="5A6072"/>
+          <w:sz w:val="19"/>
+          <w:szCs w:val="19"/>
+        </w:rPr>
+        <w:t xml:space="preserve">3.3  Cascade rules are chosen per relationship</w:t>
+      </w:r>
+      <w:r>
+        <w:rPr>
+          <w:rFonts w:ascii="Calibri" w:cs="Calibri" w:eastAsia="Calibri" w:hAnsi="Calibri"/>
+          <w:color w:val="5A6072"/>
+          <w:sz w:val="19"/>
+          <w:szCs w:val="19"/>
+        </w:rPr>
+        <w:ptab w:alignment="right" w:relativeTo="margin" w:leader="dot"/>
+      </w:r>
+      <w:r>
+        <w:rPr>
+          <w:rFonts w:ascii="Calibri" w:cs="Calibri" w:eastAsia="Calibri" w:hAnsi="Calibri"/>
+          <w:b w:val="false"/>
+          <w:bCs w:val="false"/>
+          <w:color w:val="5A6072"/>
+          <w:sz w:val="19"/>
+          <w:szCs w:val="19"/>
+        </w:rPr>
+        <w:t xml:space="preserve">9</w:t>
+      </w:r>
+    </w:p>
+    <w:p>
+      <w:pPr>
+        <w:spacing w:after="30" w:line="264"/>
+        <w:ind w:left="300"/>
+      </w:pPr>
+      <w:r>
+        <w:rPr>
+          <w:rFonts w:ascii="Calibri" w:cs="Calibri" w:eastAsia="Calibri" w:hAnsi="Calibri"/>
+          <w:b w:val="false"/>
+          <w:bCs w:val="false"/>
+          <w:color w:val="5A6072"/>
+          <w:sz w:val="19"/>
+          <w:szCs w:val="19"/>
+        </w:rPr>
+        <w:t xml:space="preserve">3.4  Three deliberate denormalisations</w:t>
+      </w:r>
+      <w:r>
+        <w:rPr>
+          <w:rFonts w:ascii="Calibri" w:cs="Calibri" w:eastAsia="Calibri" w:hAnsi="Calibri"/>
+          <w:color w:val="5A6072"/>
+          <w:sz w:val="19"/>
+          <w:szCs w:val="19"/>
+        </w:rPr>
+        <w:ptab w:alignment="right" w:relativeTo="margin" w:leader="dot"/>
+      </w:r>
+      <w:r>
+        <w:rPr>
+          <w:rFonts w:ascii="Calibri" w:cs="Calibri" w:eastAsia="Calibri" w:hAnsi="Calibri"/>
+          <w:b w:val="false"/>
+          <w:bCs w:val="false"/>
+          <w:color w:val="5A6072"/>
+          <w:sz w:val="19"/>
+          <w:szCs w:val="19"/>
+        </w:rPr>
+        <w:t xml:space="preserve">9</w:t>
+      </w:r>
+    </w:p>
+    <w:p>
+      <w:pPr>
+        <w:spacing w:after="30" w:line="264"/>
+        <w:ind w:left="300"/>
+      </w:pPr>
+      <w:r>
+        <w:rPr>
+          <w:rFonts w:ascii="Calibri" w:cs="Calibri" w:eastAsia="Calibri" w:hAnsi="Calibri"/>
+          <w:b w:val="false"/>
+          <w:bCs w:val="false"/>
+          <w:color w:val="5A6072"/>
+          <w:sz w:val="19"/>
+          <w:szCs w:val="19"/>
+        </w:rPr>
+        <w:t xml:space="preserve">3.5  Invalid states are unrepresentable</w:t>
+      </w:r>
+      <w:r>
+        <w:rPr>
+          <w:rFonts w:ascii="Calibri" w:cs="Calibri" w:eastAsia="Calibri" w:hAnsi="Calibri"/>
+          <w:color w:val="5A6072"/>
+          <w:sz w:val="19"/>
+          <w:szCs w:val="19"/>
+        </w:rPr>
+        <w:ptab w:alignment="right" w:relativeTo="margin" w:leader="dot"/>
+      </w:r>
+      <w:r>
+        <w:rPr>
+          <w:rFonts w:ascii="Calibri" w:cs="Calibri" w:eastAsia="Calibri" w:hAnsi="Calibri"/>
+          <w:b w:val="false"/>
+          <w:bCs w:val="false"/>
+          <w:color w:val="5A6072"/>
+          <w:sz w:val="19"/>
+          <w:szCs w:val="19"/>
+        </w:rPr>
+        <w:t xml:space="preserve">10</w:t>
+      </w:r>
+    </w:p>
+    <w:p>
+      <w:pPr>
+        <w:spacing w:after="60" w:line="264"/>
+        <w:ind w:left="0"/>
+      </w:pPr>
+      <w:r>
+        <w:rPr>
+          <w:rFonts w:ascii="Calibri" w:cs="Calibri" w:eastAsia="Calibri" w:hAnsi="Calibri"/>
+          <w:b/>
+          <w:bCs/>
+          <w:color w:val="1A1A1A"/>
+          <w:sz w:val="21"/>
+          <w:szCs w:val="21"/>
+        </w:rPr>
+        <w:t xml:space="preserve">4.  Atomic job claiming</w:t>
+      </w:r>
+      <w:r>
+        <w:rPr>
+          <w:rFonts w:ascii="Calibri" w:cs="Calibri" w:eastAsia="Calibri" w:hAnsi="Calibri"/>
+          <w:color w:val="1A1A1A"/>
+          <w:sz w:val="21"/>
+          <w:szCs w:val="21"/>
+        </w:rPr>
+        <w:ptab w:alignment="right" w:relativeTo="margin" w:leader="dot"/>
+      </w:r>
+      <w:r>
+        <w:rPr>
+          <w:rFonts w:ascii="Calibri" w:cs="Calibri" w:eastAsia="Calibri" w:hAnsi="Calibri"/>
+          <w:b/>
+          <w:bCs/>
+          <w:color w:val="1A1A1A"/>
+          <w:sz w:val="21"/>
+          <w:szCs w:val="21"/>
+        </w:rPr>
+        <w:t xml:space="preserve">11</w:t>
+      </w:r>
+    </w:p>
+    <w:p>
+      <w:pPr>
+        <w:spacing w:after="30" w:line="264"/>
+        <w:ind w:left="300"/>
+      </w:pPr>
+      <w:r>
+        <w:rPr>
+          <w:rFonts w:ascii="Calibri" w:cs="Calibri" w:eastAsia="Calibri" w:hAnsi="Calibri"/>
+          <w:b w:val="false"/>
+          <w:bCs w:val="false"/>
+          <w:color w:val="5A6072"/>
+          <w:sz w:val="19"/>
+          <w:szCs w:val="19"/>
+        </w:rPr>
+        <w:t xml:space="preserve">4.1  The problem</w:t>
+      </w:r>
+      <w:r>
+        <w:rPr>
+          <w:rFonts w:ascii="Calibri" w:cs="Calibri" w:eastAsia="Calibri" w:hAnsi="Calibri"/>
+          <w:color w:val="5A6072"/>
+          <w:sz w:val="19"/>
+          <w:szCs w:val="19"/>
+        </w:rPr>
+        <w:ptab w:alignment="right" w:relativeTo="margin" w:leader="dot"/>
+      </w:r>
+      <w:r>
+        <w:rPr>
+          <w:rFonts w:ascii="Calibri" w:cs="Calibri" w:eastAsia="Calibri" w:hAnsi="Calibri"/>
+          <w:b w:val="false"/>
+          <w:bCs w:val="false"/>
+          <w:color w:val="5A6072"/>
+          <w:sz w:val="19"/>
+          <w:szCs w:val="19"/>
+        </w:rPr>
+        <w:t xml:space="preserve">11</w:t>
+      </w:r>
+    </w:p>
+    <w:p>
+      <w:pPr>
+        <w:spacing w:after="30" w:line="264"/>
+        <w:ind w:left="300"/>
+      </w:pPr>
+      <w:r>
+        <w:rPr>
+          <w:rFonts w:ascii="Calibri" w:cs="Calibri" w:eastAsia="Calibri" w:hAnsi="Calibri"/>
+          <w:b w:val="false"/>
+          <w:bCs w:val="false"/>
+          <w:color w:val="5A6072"/>
+          <w:sz w:val="19"/>
+          <w:szCs w:val="19"/>
+        </w:rPr>
+        <w:t xml:space="preserve">4.2  Approaches considered</w:t>
+      </w:r>
+      <w:r>
+        <w:rPr>
+          <w:rFonts w:ascii="Calibri" w:cs="Calibri" w:eastAsia="Calibri" w:hAnsi="Calibri"/>
+          <w:color w:val="5A6072"/>
+          <w:sz w:val="19"/>
+          <w:szCs w:val="19"/>
+        </w:rPr>
+        <w:ptab w:alignment="right" w:relativeTo="margin" w:leader="dot"/>
+      </w:r>
+      <w:r>
+        <w:rPr>
+          <w:rFonts w:ascii="Calibri" w:cs="Calibri" w:eastAsia="Calibri" w:hAnsi="Calibri"/>
+          <w:b w:val="false"/>
+          <w:bCs w:val="false"/>
+          <w:color w:val="5A6072"/>
+          <w:sz w:val="19"/>
+          <w:szCs w:val="19"/>
+        </w:rPr>
+        <w:t xml:space="preserve">11</w:t>
+      </w:r>
+    </w:p>
+    <w:p>
+      <w:pPr>
+        <w:spacing w:after="30" w:line="264"/>
+        <w:ind w:left="300"/>
+      </w:pPr>
+      <w:r>
+        <w:rPr>
+          <w:rFonts w:ascii="Calibri" w:cs="Calibri" w:eastAsia="Calibri" w:hAnsi="Calibri"/>
+          <w:b w:val="false"/>
+          <w:bCs w:val="false"/>
+          <w:color w:val="5A6072"/>
+          <w:sz w:val="19"/>
+          <w:szCs w:val="19"/>
+        </w:rPr>
+        <w:t xml:space="preserve">4.3  How SKIP LOCKED works</w:t>
+      </w:r>
+      <w:r>
+        <w:rPr>
+          <w:rFonts w:ascii="Calibri" w:cs="Calibri" w:eastAsia="Calibri" w:hAnsi="Calibri"/>
+          <w:color w:val="5A6072"/>
+          <w:sz w:val="19"/>
+          <w:szCs w:val="19"/>
+        </w:rPr>
+        <w:ptab w:alignment="right" w:relativeTo="margin" w:leader="dot"/>
+      </w:r>
+      <w:r>
+        <w:rPr>
+          <w:rFonts w:ascii="Calibri" w:cs="Calibri" w:eastAsia="Calibri" w:hAnsi="Calibri"/>
+          <w:b w:val="false"/>
+          <w:bCs w:val="false"/>
+          <w:color w:val="5A6072"/>
+          <w:sz w:val="19"/>
+          <w:szCs w:val="19"/>
+        </w:rPr>
+        <w:t xml:space="preserve">11</w:t>
+      </w:r>
+    </w:p>
+    <w:p>
+      <w:pPr>
+        <w:spacing w:after="30" w:line="264"/>
+        <w:ind w:left="300"/>
+      </w:pPr>
+      <w:r>
+        <w:rPr>
+          <w:rFonts w:ascii="Calibri" w:cs="Calibri" w:eastAsia="Calibri" w:hAnsi="Calibri"/>
+          <w:b w:val="false"/>
+          <w:bCs w:val="false"/>
+          <w:color w:val="5A6072"/>
+          <w:sz w:val="19"/>
+          <w:szCs w:val="19"/>
+        </w:rPr>
+        <w:t xml:space="preserve">4.4  The claim query</w:t>
+      </w:r>
+      <w:r>
+        <w:rPr>
+          <w:rFonts w:ascii="Calibri" w:cs="Calibri" w:eastAsia="Calibri" w:hAnsi="Calibri"/>
+          <w:color w:val="5A6072"/>
+          <w:sz w:val="19"/>
+          <w:szCs w:val="19"/>
+        </w:rPr>
+        <w:ptab w:alignment="right" w:relativeTo="margin" w:leader="dot"/>
+      </w:r>
+      <w:r>
+        <w:rPr>
+          <w:rFonts w:ascii="Calibri" w:cs="Calibri" w:eastAsia="Calibri" w:hAnsi="Calibri"/>
+          <w:b w:val="false"/>
+          <w:bCs w:val="false"/>
+          <w:color w:val="5A6072"/>
+          <w:sz w:val="19"/>
+          <w:szCs w:val="19"/>
+        </w:rPr>
+        <w:t xml:space="preserve">11</w:t>
+      </w:r>
+    </w:p>
+    <w:p>
+      <w:pPr>
+        <w:spacing w:after="30" w:line="264"/>
+        <w:ind w:left="300"/>
+      </w:pPr>
+      <w:r>
+        <w:rPr>
+          <w:rFonts w:ascii="Calibri" w:cs="Calibri" w:eastAsia="Calibri" w:hAnsi="Calibri"/>
+          <w:b w:val="false"/>
+          <w:bCs w:val="false"/>
+          <w:color w:val="5A6072"/>
+          <w:sz w:val="19"/>
+          <w:szCs w:val="19"/>
+        </w:rPr>
+        <w:t xml:space="preserve">4.5  Priority: the trap in the brief</w:t>
+      </w:r>
+      <w:r>
+        <w:rPr>
+          <w:rFonts w:ascii="Calibri" w:cs="Calibri" w:eastAsia="Calibri" w:hAnsi="Calibri"/>
+          <w:color w:val="5A6072"/>
+          <w:sz w:val="19"/>
+          <w:szCs w:val="19"/>
+        </w:rPr>
+        <w:ptab w:alignment="right" w:relativeTo="margin" w:leader="dot"/>
+      </w:r>
+      <w:r>
+        <w:rPr>
+          <w:rFonts w:ascii="Calibri" w:cs="Calibri" w:eastAsia="Calibri" w:hAnsi="Calibri"/>
+          <w:b w:val="false"/>
+          <w:bCs w:val="false"/>
+          <w:color w:val="5A6072"/>
+          <w:sz w:val="19"/>
+          <w:szCs w:val="19"/>
+        </w:rPr>
+        <w:t xml:space="preserve">12</w:t>
+      </w:r>
+    </w:p>
+    <w:p>
+      <w:pPr>
+        <w:spacing w:after="60" w:line="264"/>
+        <w:ind w:left="0"/>
+      </w:pPr>
+      <w:r>
+        <w:rPr>
+          <w:rFonts w:ascii="Calibri" w:cs="Calibri" w:eastAsia="Calibri" w:hAnsi="Calibri"/>
+          <w:b/>
+          <w:bCs/>
+          <w:color w:val="1A1A1A"/>
+          <w:sz w:val="21"/>
+          <w:szCs w:val="21"/>
+        </w:rPr>
+        <w:t xml:space="preserve">5.  Job lifecycle and crash recovery</w:t>
+      </w:r>
+      <w:r>
+        <w:rPr>
+          <w:rFonts w:ascii="Calibri" w:cs="Calibri" w:eastAsia="Calibri" w:hAnsi="Calibri"/>
+          <w:color w:val="1A1A1A"/>
+          <w:sz w:val="21"/>
+          <w:szCs w:val="21"/>
+        </w:rPr>
+        <w:ptab w:alignment="right" w:relativeTo="margin" w:leader="dot"/>
+      </w:r>
+      <w:r>
+        <w:rPr>
+          <w:rFonts w:ascii="Calibri" w:cs="Calibri" w:eastAsia="Calibri" w:hAnsi="Calibri"/>
+          <w:b/>
+          <w:bCs/>
+          <w:color w:val="1A1A1A"/>
+          <w:sz w:val="21"/>
+          <w:szCs w:val="21"/>
+        </w:rPr>
+        <w:t xml:space="preserve">14</w:t>
+      </w:r>
+    </w:p>
+    <w:p>
+      <w:pPr>
+        <w:spacing w:after="30" w:line="264"/>
+        <w:ind w:left="300"/>
+      </w:pPr>
+      <w:r>
+        <w:rPr>
+          <w:rFonts w:ascii="Calibri" w:cs="Calibri" w:eastAsia="Calibri" w:hAnsi="Calibri"/>
+          <w:b w:val="false"/>
+          <w:bCs w:val="false"/>
+          <w:color w:val="5A6072"/>
+          <w:sz w:val="19"/>
+          <w:szCs w:val="19"/>
+        </w:rPr>
+        <w:t xml:space="preserve">5.1  Where "Failed" went</w:t>
+      </w:r>
+      <w:r>
+        <w:rPr>
+          <w:rFonts w:ascii="Calibri" w:cs="Calibri" w:eastAsia="Calibri" w:hAnsi="Calibri"/>
+          <w:color w:val="5A6072"/>
+          <w:sz w:val="19"/>
+          <w:szCs w:val="19"/>
+        </w:rPr>
+        <w:ptab w:alignment="right" w:relativeTo="margin" w:leader="dot"/>
+      </w:r>
+      <w:r>
+        <w:rPr>
+          <w:rFonts w:ascii="Calibri" w:cs="Calibri" w:eastAsia="Calibri" w:hAnsi="Calibri"/>
+          <w:b w:val="false"/>
+          <w:bCs w:val="false"/>
+          <w:color w:val="5A6072"/>
+          <w:sz w:val="19"/>
+          <w:szCs w:val="19"/>
+        </w:rPr>
+        <w:t xml:space="preserve">14</w:t>
+      </w:r>
+    </w:p>
+    <w:p>
+      <w:pPr>
+        <w:spacing w:after="30" w:line="264"/>
+        <w:ind w:left="300"/>
+      </w:pPr>
+      <w:r>
+        <w:rPr>
+          <w:rFonts w:ascii="Calibri" w:cs="Calibri" w:eastAsia="Calibri" w:hAnsi="Calibri"/>
+          <w:b w:val="false"/>
+          <w:bCs w:val="false"/>
+          <w:color w:val="5A6072"/>
+          <w:sz w:val="19"/>
+          <w:szCs w:val="19"/>
+        </w:rPr>
+        <w:t xml:space="preserve">5.2  The conditional write</w:t>
+      </w:r>
+      <w:r>
+        <w:rPr>
+          <w:rFonts w:ascii="Calibri" w:cs="Calibri" w:eastAsia="Calibri" w:hAnsi="Calibri"/>
+          <w:color w:val="5A6072"/>
+          <w:sz w:val="19"/>
+          <w:szCs w:val="19"/>
+        </w:rPr>
+        <w:ptab w:alignment="right" w:relativeTo="margin" w:leader="dot"/>
+      </w:r>
+      <w:r>
+        <w:rPr>
+          <w:rFonts w:ascii="Calibri" w:cs="Calibri" w:eastAsia="Calibri" w:hAnsi="Calibri"/>
+          <w:b w:val="false"/>
+          <w:bCs w:val="false"/>
+          <w:color w:val="5A6072"/>
+          <w:sz w:val="19"/>
+          <w:szCs w:val="19"/>
+        </w:rPr>
+        <w:t xml:space="preserve">14</w:t>
+      </w:r>
+    </w:p>
+    <w:p>
+      <w:pPr>
+        <w:spacing w:after="30" w:line="264"/>
+        <w:ind w:left="300"/>
+      </w:pPr>
+      <w:r>
+        <w:rPr>
+          <w:rFonts w:ascii="Calibri" w:cs="Calibri" w:eastAsia="Calibri" w:hAnsi="Calibri"/>
+          <w:b w:val="false"/>
+          <w:bCs w:val="false"/>
+          <w:color w:val="5A6072"/>
+          <w:sz w:val="19"/>
+          <w:szCs w:val="19"/>
+        </w:rPr>
+        <w:t xml:space="preserve">5.3  Crash recovery</w:t>
+      </w:r>
+      <w:r>
+        <w:rPr>
+          <w:rFonts w:ascii="Calibri" w:cs="Calibri" w:eastAsia="Calibri" w:hAnsi="Calibri"/>
+          <w:color w:val="5A6072"/>
+          <w:sz w:val="19"/>
+          <w:szCs w:val="19"/>
+        </w:rPr>
+        <w:ptab w:alignment="right" w:relativeTo="margin" w:leader="dot"/>
+      </w:r>
+      <w:r>
+        <w:rPr>
+          <w:rFonts w:ascii="Calibri" w:cs="Calibri" w:eastAsia="Calibri" w:hAnsi="Calibri"/>
+          <w:b w:val="false"/>
+          <w:bCs w:val="false"/>
+          <w:color w:val="5A6072"/>
+          <w:sz w:val="19"/>
+          <w:szCs w:val="19"/>
+        </w:rPr>
+        <w:t xml:space="preserve">14</w:t>
+      </w:r>
+    </w:p>
+    <w:p>
+      <w:pPr>
+        <w:spacing w:after="30" w:line="264"/>
+        <w:ind w:left="300"/>
+      </w:pPr>
+      <w:r>
+        <w:rPr>
+          <w:rFonts w:ascii="Calibri" w:cs="Calibri" w:eastAsia="Calibri" w:hAnsi="Calibri"/>
+          <w:b w:val="false"/>
+          <w:bCs w:val="false"/>
+          <w:color w:val="5A6072"/>
+          <w:sz w:val="19"/>
+          <w:szCs w:val="19"/>
+        </w:rPr>
+        <w:t xml:space="preserve">5.4  Heartbeats and the timing invariant</w:t>
+      </w:r>
+      <w:r>
+        <w:rPr>
+          <w:rFonts w:ascii="Calibri" w:cs="Calibri" w:eastAsia="Calibri" w:hAnsi="Calibri"/>
+          <w:color w:val="5A6072"/>
+          <w:sz w:val="19"/>
+          <w:szCs w:val="19"/>
+        </w:rPr>
+        <w:ptab w:alignment="right" w:relativeTo="margin" w:leader="dot"/>
+      </w:r>
+      <w:r>
+        <w:rPr>
+          <w:rFonts w:ascii="Calibri" w:cs="Calibri" w:eastAsia="Calibri" w:hAnsi="Calibri"/>
+          <w:b w:val="false"/>
+          <w:bCs w:val="false"/>
+          <w:color w:val="5A6072"/>
+          <w:sz w:val="19"/>
+          <w:szCs w:val="19"/>
+        </w:rPr>
+        <w:t xml:space="preserve">15</w:t>
+      </w:r>
+    </w:p>
+    <w:p>
+      <w:pPr>
+        <w:spacing w:after="30" w:line="264"/>
+        <w:ind w:left="300"/>
+      </w:pPr>
+      <w:r>
+        <w:rPr>
+          <w:rFonts w:ascii="Calibri" w:cs="Calibri" w:eastAsia="Calibri" w:hAnsi="Calibri"/>
+          <w:b w:val="false"/>
+          <w:bCs w:val="false"/>
+          <w:color w:val="5A6072"/>
+          <w:sz w:val="19"/>
+          <w:szCs w:val="19"/>
+        </w:rPr>
+        <w:t xml:space="preserve">5.5  Graceful shutdown</w:t>
+      </w:r>
+      <w:r>
+        <w:rPr>
+          <w:rFonts w:ascii="Calibri" w:cs="Calibri" w:eastAsia="Calibri" w:hAnsi="Calibri"/>
+          <w:color w:val="5A6072"/>
+          <w:sz w:val="19"/>
+          <w:szCs w:val="19"/>
+        </w:rPr>
+        <w:ptab w:alignment="right" w:relativeTo="margin" w:leader="dot"/>
+      </w:r>
+      <w:r>
+        <w:rPr>
+          <w:rFonts w:ascii="Calibri" w:cs="Calibri" w:eastAsia="Calibri" w:hAnsi="Calibri"/>
+          <w:b w:val="false"/>
+          <w:bCs w:val="false"/>
+          <w:color w:val="5A6072"/>
+          <w:sz w:val="19"/>
+          <w:szCs w:val="19"/>
+        </w:rPr>
+        <w:t xml:space="preserve">16</w:t>
+      </w:r>
+    </w:p>
+    <w:p>
+      <w:pPr>
+        <w:spacing w:after="60" w:line="264"/>
+        <w:ind w:left="0"/>
+      </w:pPr>
+      <w:r>
+        <w:rPr>
+          <w:rFonts w:ascii="Calibri" w:cs="Calibri" w:eastAsia="Calibri" w:hAnsi="Calibri"/>
+          <w:b/>
+          <w:bCs/>
+          <w:color w:val="1A1A1A"/>
+          <w:sz w:val="21"/>
+          <w:szCs w:val="21"/>
+        </w:rPr>
+        <w:t xml:space="preserve">6.  Retries and backoff</w:t>
+      </w:r>
+      <w:r>
+        <w:rPr>
+          <w:rFonts w:ascii="Calibri" w:cs="Calibri" w:eastAsia="Calibri" w:hAnsi="Calibri"/>
+          <w:color w:val="1A1A1A"/>
+          <w:sz w:val="21"/>
+          <w:szCs w:val="21"/>
+        </w:rPr>
+        <w:ptab w:alignment="right" w:relativeTo="margin" w:leader="dot"/>
+      </w:r>
+      <w:r>
+        <w:rPr>
+          <w:rFonts w:ascii="Calibri" w:cs="Calibri" w:eastAsia="Calibri" w:hAnsi="Calibri"/>
+          <w:b/>
+          <w:bCs/>
+          <w:color w:val="1A1A1A"/>
+          <w:sz w:val="21"/>
+          <w:szCs w:val="21"/>
+        </w:rPr>
+        <w:t xml:space="preserve">17</w:t>
+      </w:r>
+    </w:p>
+    <w:p>
+      <w:pPr>
+        <w:spacing w:after="30" w:line="264"/>
+        <w:ind w:left="300"/>
+      </w:pPr>
+      <w:r>
+        <w:rPr>
+          <w:rFonts w:ascii="Calibri" w:cs="Calibri" w:eastAsia="Calibri" w:hAnsi="Calibri"/>
+          <w:b w:val="false"/>
+          <w:bCs w:val="false"/>
+          <w:color w:val="5A6072"/>
+          <w:sz w:val="19"/>
+          <w:szCs w:val="19"/>
+        </w:rPr>
+        <w:t xml:space="preserve">6.1  The three strategies</w:t>
+      </w:r>
+      <w:r>
+        <w:rPr>
+          <w:rFonts w:ascii="Calibri" w:cs="Calibri" w:eastAsia="Calibri" w:hAnsi="Calibri"/>
+          <w:color w:val="5A6072"/>
+          <w:sz w:val="19"/>
+          <w:szCs w:val="19"/>
+        </w:rPr>
+        <w:ptab w:alignment="right" w:relativeTo="margin" w:leader="dot"/>
+      </w:r>
+      <w:r>
+        <w:rPr>
+          <w:rFonts w:ascii="Calibri" w:cs="Calibri" w:eastAsia="Calibri" w:hAnsi="Calibri"/>
+          <w:b w:val="false"/>
+          <w:bCs w:val="false"/>
+          <w:color w:val="5A6072"/>
+          <w:sz w:val="19"/>
+          <w:szCs w:val="19"/>
+        </w:rPr>
+        <w:t xml:space="preserve">17</w:t>
+      </w:r>
+    </w:p>
+    <w:p>
+      <w:pPr>
+        <w:spacing w:after="30" w:line="264"/>
+        <w:ind w:left="300"/>
+      </w:pPr>
+      <w:r>
+        <w:rPr>
+          <w:rFonts w:ascii="Calibri" w:cs="Calibri" w:eastAsia="Calibri" w:hAnsi="Calibri"/>
+          <w:b w:val="false"/>
+          <w:bCs w:val="false"/>
+          <w:color w:val="5A6072"/>
+          <w:sz w:val="19"/>
+          <w:szCs w:val="19"/>
+        </w:rPr>
+        <w:t xml:space="preserve">6.2  Jitter is not decoration</w:t>
+      </w:r>
+      <w:r>
+        <w:rPr>
+          <w:rFonts w:ascii="Calibri" w:cs="Calibri" w:eastAsia="Calibri" w:hAnsi="Calibri"/>
+          <w:color w:val="5A6072"/>
+          <w:sz w:val="19"/>
+          <w:szCs w:val="19"/>
+        </w:rPr>
+        <w:ptab w:alignment="right" w:relativeTo="margin" w:leader="dot"/>
+      </w:r>
+      <w:r>
+        <w:rPr>
+          <w:rFonts w:ascii="Calibri" w:cs="Calibri" w:eastAsia="Calibri" w:hAnsi="Calibri"/>
+          <w:b w:val="false"/>
+          <w:bCs w:val="false"/>
+          <w:color w:val="5A6072"/>
+          <w:sz w:val="19"/>
+          <w:szCs w:val="19"/>
+        </w:rPr>
+        <w:t xml:space="preserve">17</w:t>
+      </w:r>
+    </w:p>
+    <w:p>
+      <w:pPr>
+        <w:spacing w:after="30" w:line="264"/>
+        <w:ind w:left="300"/>
+      </w:pPr>
+      <w:r>
+        <w:rPr>
+          <w:rFonts w:ascii="Calibri" w:cs="Calibri" w:eastAsia="Calibri" w:hAnsi="Calibri"/>
+          <w:b w:val="false"/>
+          <w:bCs w:val="false"/>
+          <w:color w:val="5A6072"/>
+          <w:sz w:val="19"/>
+          <w:szCs w:val="19"/>
+        </w:rPr>
+        <w:t xml:space="preserve">6.3  The worker does not sleep</w:t>
+      </w:r>
+      <w:r>
+        <w:rPr>
+          <w:rFonts w:ascii="Calibri" w:cs="Calibri" w:eastAsia="Calibri" w:hAnsi="Calibri"/>
+          <w:color w:val="5A6072"/>
+          <w:sz w:val="19"/>
+          <w:szCs w:val="19"/>
+        </w:rPr>
+        <w:ptab w:alignment="right" w:relativeTo="margin" w:leader="dot"/>
+      </w:r>
+      <w:r>
+        <w:rPr>
+          <w:rFonts w:ascii="Calibri" w:cs="Calibri" w:eastAsia="Calibri" w:hAnsi="Calibri"/>
+          <w:b w:val="false"/>
+          <w:bCs w:val="false"/>
+          <w:color w:val="5A6072"/>
+          <w:sz w:val="19"/>
+          <w:szCs w:val="19"/>
+        </w:rPr>
+        <w:t xml:space="preserve">18</w:t>
+      </w:r>
+    </w:p>
+    <w:p>
+      <w:pPr>
+        <w:spacing w:after="30" w:line="264"/>
+        <w:ind w:left="300"/>
+      </w:pPr>
+      <w:r>
+        <w:rPr>
+          <w:rFonts w:ascii="Calibri" w:cs="Calibri" w:eastAsia="Calibri" w:hAnsi="Calibri"/>
+          <w:b w:val="false"/>
+          <w:bCs w:val="false"/>
+          <w:color w:val="5A6072"/>
+          <w:sz w:val="19"/>
+          <w:szCs w:val="19"/>
+        </w:rPr>
+        <w:t xml:space="preserve">6.4  Not every failure deserves five attempts</w:t>
+      </w:r>
+      <w:r>
+        <w:rPr>
+          <w:rFonts w:ascii="Calibri" w:cs="Calibri" w:eastAsia="Calibri" w:hAnsi="Calibri"/>
+          <w:color w:val="5A6072"/>
+          <w:sz w:val="19"/>
+          <w:szCs w:val="19"/>
+        </w:rPr>
+        <w:ptab w:alignment="right" w:relativeTo="margin" w:leader="dot"/>
+      </w:r>
+      <w:r>
+        <w:rPr>
+          <w:rFonts w:ascii="Calibri" w:cs="Calibri" w:eastAsia="Calibri" w:hAnsi="Calibri"/>
+          <w:b w:val="false"/>
+          <w:bCs w:val="false"/>
+          <w:color w:val="5A6072"/>
+          <w:sz w:val="19"/>
+          <w:szCs w:val="19"/>
+        </w:rPr>
+        <w:t xml:space="preserve">18</w:t>
+      </w:r>
+    </w:p>
+    <w:p>
+      <w:pPr>
+        <w:spacing w:after="60" w:line="264"/>
+        <w:ind w:left="0"/>
+      </w:pPr>
+      <w:r>
+        <w:rPr>
+          <w:rFonts w:ascii="Calibri" w:cs="Calibri" w:eastAsia="Calibri" w:hAnsi="Calibri"/>
+          <w:b/>
+          <w:bCs/>
+          <w:color w:val="1A1A1A"/>
+          <w:sz w:val="21"/>
+          <w:szCs w:val="21"/>
+        </w:rPr>
+        <w:t xml:space="preserve">7.  Dead letter queue</w:t>
+      </w:r>
+      <w:r>
+        <w:rPr>
+          <w:rFonts w:ascii="Calibri" w:cs="Calibri" w:eastAsia="Calibri" w:hAnsi="Calibri"/>
+          <w:color w:val="1A1A1A"/>
+          <w:sz w:val="21"/>
+          <w:szCs w:val="21"/>
+        </w:rPr>
+        <w:ptab w:alignment="right" w:relativeTo="margin" w:leader="dot"/>
+      </w:r>
+      <w:r>
+        <w:rPr>
+          <w:rFonts w:ascii="Calibri" w:cs="Calibri" w:eastAsia="Calibri" w:hAnsi="Calibri"/>
+          <w:b/>
+          <w:bCs/>
+          <w:color w:val="1A1A1A"/>
+          <w:sz w:val="21"/>
+          <w:szCs w:val="21"/>
+        </w:rPr>
+        <w:t xml:space="preserve">18</w:t>
+      </w:r>
+    </w:p>
+    <w:p>
+      <w:pPr>
+        <w:spacing w:after="30" w:line="264"/>
+        <w:ind w:left="300"/>
+      </w:pPr>
+      <w:r>
+        <w:rPr>
+          <w:rFonts w:ascii="Calibri" w:cs="Calibri" w:eastAsia="Calibri" w:hAnsi="Calibri"/>
+          <w:b w:val="false"/>
+          <w:bCs w:val="false"/>
+          <w:color w:val="5A6072"/>
+          <w:sz w:val="19"/>
+          <w:szCs w:val="19"/>
+        </w:rPr>
+        <w:t xml:space="preserve">7.1  What happens, transactionally</w:t>
+      </w:r>
+      <w:r>
+        <w:rPr>
+          <w:rFonts w:ascii="Calibri" w:cs="Calibri" w:eastAsia="Calibri" w:hAnsi="Calibri"/>
+          <w:color w:val="5A6072"/>
+          <w:sz w:val="19"/>
+          <w:szCs w:val="19"/>
+        </w:rPr>
+        <w:ptab w:alignment="right" w:relativeTo="margin" w:leader="dot"/>
+      </w:r>
+      <w:r>
+        <w:rPr>
+          <w:rFonts w:ascii="Calibri" w:cs="Calibri" w:eastAsia="Calibri" w:hAnsi="Calibri"/>
+          <w:b w:val="false"/>
+          <w:bCs w:val="false"/>
+          <w:color w:val="5A6072"/>
+          <w:sz w:val="19"/>
+          <w:szCs w:val="19"/>
+        </w:rPr>
+        <w:t xml:space="preserve">18</w:t>
+      </w:r>
+    </w:p>
+    <w:p>
+      <w:pPr>
+        <w:spacing w:after="30" w:line="264"/>
+        <w:ind w:left="300"/>
+      </w:pPr>
+      <w:r>
+        <w:rPr>
+          <w:rFonts w:ascii="Calibri" w:cs="Calibri" w:eastAsia="Calibri" w:hAnsi="Calibri"/>
+          <w:b w:val="false"/>
+          <w:bCs w:val="false"/>
+          <w:color w:val="5A6072"/>
+          <w:sz w:val="19"/>
+          <w:szCs w:val="19"/>
+        </w:rPr>
+        <w:t xml:space="preserve">7.2  Triage by error signature</w:t>
+      </w:r>
+      <w:r>
+        <w:rPr>
+          <w:rFonts w:ascii="Calibri" w:cs="Calibri" w:eastAsia="Calibri" w:hAnsi="Calibri"/>
+          <w:color w:val="5A6072"/>
+          <w:sz w:val="19"/>
+          <w:szCs w:val="19"/>
+        </w:rPr>
+        <w:ptab w:alignment="right" w:relativeTo="margin" w:leader="dot"/>
+      </w:r>
+      <w:r>
+        <w:rPr>
+          <w:rFonts w:ascii="Calibri" w:cs="Calibri" w:eastAsia="Calibri" w:hAnsi="Calibri"/>
+          <w:b w:val="false"/>
+          <w:bCs w:val="false"/>
+          <w:color w:val="5A6072"/>
+          <w:sz w:val="19"/>
+          <w:szCs w:val="19"/>
+        </w:rPr>
+        <w:t xml:space="preserve">18</w:t>
+      </w:r>
+    </w:p>
+    <w:p>
+      <w:pPr>
+        <w:spacing w:after="30" w:line="264"/>
+        <w:ind w:left="300"/>
+      </w:pPr>
+      <w:r>
+        <w:rPr>
+          <w:rFonts w:ascii="Calibri" w:cs="Calibri" w:eastAsia="Calibri" w:hAnsi="Calibri"/>
+          <w:b w:val="false"/>
+          <w:bCs w:val="false"/>
+          <w:color w:val="5A6072"/>
+          <w:sz w:val="19"/>
+          <w:szCs w:val="19"/>
+        </w:rPr>
+        <w:t xml:space="preserve">7.3  Replay creates a new job</w:t>
+      </w:r>
+      <w:r>
+        <w:rPr>
+          <w:rFonts w:ascii="Calibri" w:cs="Calibri" w:eastAsia="Calibri" w:hAnsi="Calibri"/>
+          <w:color w:val="5A6072"/>
+          <w:sz w:val="19"/>
+          <w:szCs w:val="19"/>
+        </w:rPr>
+        <w:ptab w:alignment="right" w:relativeTo="margin" w:leader="dot"/>
+      </w:r>
+      <w:r>
+        <w:rPr>
+          <w:rFonts w:ascii="Calibri" w:cs="Calibri" w:eastAsia="Calibri" w:hAnsi="Calibri"/>
+          <w:b w:val="false"/>
+          <w:bCs w:val="false"/>
+          <w:color w:val="5A6072"/>
+          <w:sz w:val="19"/>
+          <w:szCs w:val="19"/>
+        </w:rPr>
+        <w:t xml:space="preserve">18</w:t>
+      </w:r>
+    </w:p>
+    <w:p>
+      <w:pPr>
+        <w:spacing w:after="60" w:line="264"/>
+        <w:ind w:left="0"/>
+      </w:pPr>
+      <w:r>
+        <w:rPr>
+          <w:rFonts w:ascii="Calibri" w:cs="Calibri" w:eastAsia="Calibri" w:hAnsi="Calibri"/>
+          <w:b/>
+          <w:bCs/>
+          <w:color w:val="1A1A1A"/>
+          <w:sz w:val="21"/>
+          <w:szCs w:val="21"/>
+        </w:rPr>
+        <w:t xml:space="preserve">8.  Idempotency</w:t>
+      </w:r>
+      <w:r>
+        <w:rPr>
+          <w:rFonts w:ascii="Calibri" w:cs="Calibri" w:eastAsia="Calibri" w:hAnsi="Calibri"/>
+          <w:color w:val="1A1A1A"/>
+          <w:sz w:val="21"/>
+          <w:szCs w:val="21"/>
+        </w:rPr>
+        <w:ptab w:alignment="right" w:relativeTo="margin" w:leader="dot"/>
+      </w:r>
+      <w:r>
+        <w:rPr>
+          <w:rFonts w:ascii="Calibri" w:cs="Calibri" w:eastAsia="Calibri" w:hAnsi="Calibri"/>
+          <w:b/>
+          <w:bCs/>
+          <w:color w:val="1A1A1A"/>
+          <w:sz w:val="21"/>
+          <w:szCs w:val="21"/>
+        </w:rPr>
+        <w:t xml:space="preserve">20</w:t>
+      </w:r>
+    </w:p>
+    <w:p>
+      <w:pPr>
+        <w:spacing w:after="30" w:line="264"/>
+        <w:ind w:left="300"/>
+      </w:pPr>
+      <w:r>
+        <w:rPr>
+          <w:rFonts w:ascii="Calibri" w:cs="Calibri" w:eastAsia="Calibri" w:hAnsi="Calibri"/>
+          <w:b w:val="false"/>
+          <w:bCs w:val="false"/>
+          <w:color w:val="5A6072"/>
+          <w:sz w:val="19"/>
+          <w:szCs w:val="19"/>
+        </w:rPr>
+        <w:t xml:space="preserve">8.1  Duplicate submission — fully solvable</w:t>
+      </w:r>
+      <w:r>
+        <w:rPr>
+          <w:rFonts w:ascii="Calibri" w:cs="Calibri" w:eastAsia="Calibri" w:hAnsi="Calibri"/>
+          <w:color w:val="5A6072"/>
+          <w:sz w:val="19"/>
+          <w:szCs w:val="19"/>
+        </w:rPr>
+        <w:ptab w:alignment="right" w:relativeTo="margin" w:leader="dot"/>
+      </w:r>
+      <w:r>
+        <w:rPr>
+          <w:rFonts w:ascii="Calibri" w:cs="Calibri" w:eastAsia="Calibri" w:hAnsi="Calibri"/>
+          <w:b w:val="false"/>
+          <w:bCs w:val="false"/>
+          <w:color w:val="5A6072"/>
+          <w:sz w:val="19"/>
+          <w:szCs w:val="19"/>
+        </w:rPr>
+        <w:t xml:space="preserve">20</w:t>
+      </w:r>
+    </w:p>
+    <w:p>
+      <w:pPr>
+        <w:spacing w:after="30" w:line="264"/>
+        <w:ind w:left="300"/>
+      </w:pPr>
+      <w:r>
+        <w:rPr>
+          <w:rFonts w:ascii="Calibri" w:cs="Calibri" w:eastAsia="Calibri" w:hAnsi="Calibri"/>
+          <w:b w:val="false"/>
+          <w:bCs w:val="false"/>
+          <w:color w:val="5A6072"/>
+          <w:sz w:val="19"/>
+          <w:szCs w:val="19"/>
+        </w:rPr>
+        <w:t xml:space="preserve">8.2  Duplicate execution — not fully solvable</w:t>
+      </w:r>
+      <w:r>
+        <w:rPr>
+          <w:rFonts w:ascii="Calibri" w:cs="Calibri" w:eastAsia="Calibri" w:hAnsi="Calibri"/>
+          <w:color w:val="5A6072"/>
+          <w:sz w:val="19"/>
+          <w:szCs w:val="19"/>
+        </w:rPr>
+        <w:ptab w:alignment="right" w:relativeTo="margin" w:leader="dot"/>
+      </w:r>
+      <w:r>
+        <w:rPr>
+          <w:rFonts w:ascii="Calibri" w:cs="Calibri" w:eastAsia="Calibri" w:hAnsi="Calibri"/>
+          <w:b w:val="false"/>
+          <w:bCs w:val="false"/>
+          <w:color w:val="5A6072"/>
+          <w:sz w:val="19"/>
+          <w:szCs w:val="19"/>
+        </w:rPr>
+        <w:t xml:space="preserve">20</w:t>
+      </w:r>
+    </w:p>
+    <w:p>
+      <w:pPr>
+        <w:spacing w:after="60" w:line="264"/>
+        <w:ind w:left="0"/>
+      </w:pPr>
+      <w:r>
+        <w:rPr>
+          <w:rFonts w:ascii="Calibri" w:cs="Calibri" w:eastAsia="Calibri" w:hAnsi="Calibri"/>
+          <w:b/>
+          <w:bCs/>
+          <w:color w:val="1A1A1A"/>
+          <w:sz w:val="21"/>
+          <w:szCs w:val="21"/>
+        </w:rPr>
+        <w:t xml:space="preserve">9.  Design decisions and trade-offs</w:t>
+      </w:r>
+      <w:r>
+        <w:rPr>
+          <w:rFonts w:ascii="Calibri" w:cs="Calibri" w:eastAsia="Calibri" w:hAnsi="Calibri"/>
+          <w:color w:val="1A1A1A"/>
+          <w:sz w:val="21"/>
+          <w:szCs w:val="21"/>
+        </w:rPr>
+        <w:ptab w:alignment="right" w:relativeTo="margin" w:leader="dot"/>
+      </w:r>
+      <w:r>
+        <w:rPr>
+          <w:rFonts w:ascii="Calibri" w:cs="Calibri" w:eastAsia="Calibri" w:hAnsi="Calibri"/>
+          <w:b/>
+          <w:bCs/>
+          <w:color w:val="1A1A1A"/>
+          <w:sz w:val="21"/>
+          <w:szCs w:val="21"/>
+        </w:rPr>
+        <w:t xml:space="preserve">21</w:t>
+      </w:r>
+    </w:p>
+    <w:p>
+      <w:pPr>
+        <w:spacing w:after="30" w:line="264"/>
+        <w:ind w:left="300"/>
+      </w:pPr>
+      <w:r>
+        <w:rPr>
+          <w:rFonts w:ascii="Calibri" w:cs="Calibri" w:eastAsia="Calibri" w:hAnsi="Calibri"/>
+          <w:b w:val="false"/>
+          <w:bCs w:val="false"/>
+          <w:color w:val="5A6072"/>
+          <w:sz w:val="19"/>
+          <w:szCs w:val="19"/>
+        </w:rPr>
+        <w:t xml:space="preserve">9.11  Deliberately not built</w:t>
+      </w:r>
+      <w:r>
+        <w:rPr>
+          <w:rFonts w:ascii="Calibri" w:cs="Calibri" w:eastAsia="Calibri" w:hAnsi="Calibri"/>
+          <w:color w:val="5A6072"/>
+          <w:sz w:val="19"/>
+          <w:szCs w:val="19"/>
+        </w:rPr>
+        <w:ptab w:alignment="right" w:relativeTo="margin" w:leader="dot"/>
+      </w:r>
+      <w:r>
+        <w:rPr>
+          <w:rFonts w:ascii="Calibri" w:cs="Calibri" w:eastAsia="Calibri" w:hAnsi="Calibri"/>
+          <w:b w:val="false"/>
+          <w:bCs w:val="false"/>
+          <w:color w:val="5A6072"/>
+          <w:sz w:val="19"/>
+          <w:szCs w:val="19"/>
+        </w:rPr>
+        <w:t xml:space="preserve">22</w:t>
+      </w:r>
+    </w:p>
+    <w:p>
+      <w:pPr>
+        <w:spacing w:after="60" w:line="264"/>
+        <w:ind w:left="0"/>
+      </w:pPr>
+      <w:r>
+        <w:rPr>
+          <w:rFonts w:ascii="Calibri" w:cs="Calibri" w:eastAsia="Calibri" w:hAnsi="Calibri"/>
+          <w:b/>
+          <w:bCs/>
+          <w:color w:val="1A1A1A"/>
+          <w:sz w:val="21"/>
+          <w:szCs w:val="21"/>
+        </w:rPr>
+        <w:t xml:space="preserve">10.  API design</w:t>
+      </w:r>
+      <w:r>
+        <w:rPr>
+          <w:rFonts w:ascii="Calibri" w:cs="Calibri" w:eastAsia="Calibri" w:hAnsi="Calibri"/>
+          <w:color w:val="1A1A1A"/>
+          <w:sz w:val="21"/>
+          <w:szCs w:val="21"/>
+        </w:rPr>
+        <w:ptab w:alignment="right" w:relativeTo="margin" w:leader="dot"/>
+      </w:r>
+      <w:r>
+        <w:rPr>
+          <w:rFonts w:ascii="Calibri" w:cs="Calibri" w:eastAsia="Calibri" w:hAnsi="Calibri"/>
+          <w:b/>
+          <w:bCs/>
+          <w:color w:val="1A1A1A"/>
+          <w:sz w:val="21"/>
+          <w:szCs w:val="21"/>
+        </w:rPr>
+        <w:t xml:space="preserve">23</w:t>
+      </w:r>
+    </w:p>
+    <w:p>
+      <w:pPr>
+        <w:spacing w:after="30" w:line="264"/>
+        <w:ind w:left="300"/>
+      </w:pPr>
+      <w:r>
+        <w:rPr>
+          <w:rFonts w:ascii="Calibri" w:cs="Calibri" w:eastAsia="Calibri" w:hAnsi="Calibri"/>
+          <w:b w:val="false"/>
+          <w:bCs w:val="false"/>
+          <w:color w:val="5A6072"/>
+          <w:sz w:val="19"/>
+          <w:szCs w:val="19"/>
+        </w:rPr>
+        <w:t xml:space="preserve">10.1  Conventions</w:t>
+      </w:r>
+      <w:r>
+        <w:rPr>
+          <w:rFonts w:ascii="Calibri" w:cs="Calibri" w:eastAsia="Calibri" w:hAnsi="Calibri"/>
+          <w:color w:val="5A6072"/>
+          <w:sz w:val="19"/>
+          <w:szCs w:val="19"/>
+        </w:rPr>
+        <w:ptab w:alignment="right" w:relativeTo="margin" w:leader="dot"/>
+      </w:r>
+      <w:r>
+        <w:rPr>
+          <w:rFonts w:ascii="Calibri" w:cs="Calibri" w:eastAsia="Calibri" w:hAnsi="Calibri"/>
+          <w:b w:val="false"/>
+          <w:bCs w:val="false"/>
+          <w:color w:val="5A6072"/>
+          <w:sz w:val="19"/>
+          <w:szCs w:val="19"/>
+        </w:rPr>
+        <w:t xml:space="preserve">23</w:t>
+      </w:r>
+    </w:p>
+    <w:p>
+      <w:pPr>
+        <w:spacing w:after="30" w:line="264"/>
+        <w:ind w:left="300"/>
+      </w:pPr>
+      <w:r>
+        <w:rPr>
+          <w:rFonts w:ascii="Calibri" w:cs="Calibri" w:eastAsia="Calibri" w:hAnsi="Calibri"/>
+          <w:b w:val="false"/>
+          <w:bCs w:val="false"/>
+          <w:color w:val="5A6072"/>
+          <w:sz w:val="19"/>
+          <w:szCs w:val="19"/>
+        </w:rPr>
+        <w:t xml:space="preserve">10.2  No POST /workers</w:t>
+      </w:r>
+      <w:r>
+        <w:rPr>
+          <w:rFonts w:ascii="Calibri" w:cs="Calibri" w:eastAsia="Calibri" w:hAnsi="Calibri"/>
+          <w:color w:val="5A6072"/>
+          <w:sz w:val="19"/>
+          <w:szCs w:val="19"/>
+        </w:rPr>
+        <w:ptab w:alignment="right" w:relativeTo="margin" w:leader="dot"/>
+      </w:r>
+      <w:r>
+        <w:rPr>
+          <w:rFonts w:ascii="Calibri" w:cs="Calibri" w:eastAsia="Calibri" w:hAnsi="Calibri"/>
+          <w:b w:val="false"/>
+          <w:bCs w:val="false"/>
+          <w:color w:val="5A6072"/>
+          <w:sz w:val="19"/>
+          <w:szCs w:val="19"/>
+        </w:rPr>
+        <w:t xml:space="preserve">23</w:t>
+      </w:r>
+    </w:p>
+    <w:p>
+      <w:pPr>
+        <w:spacing w:after="60" w:line="264"/>
+        <w:ind w:left="0"/>
+      </w:pPr>
+      <w:r>
+        <w:rPr>
+          <w:rFonts w:ascii="Calibri" w:cs="Calibri" w:eastAsia="Calibri" w:hAnsi="Calibri"/>
+          <w:b/>
+          <w:bCs/>
+          <w:color w:val="1A1A1A"/>
+          <w:sz w:val="21"/>
+          <w:szCs w:val="21"/>
+        </w:rPr>
+        <w:t xml:space="preserve">11.  Testing strategy</w:t>
+      </w:r>
+      <w:r>
+        <w:rPr>
+          <w:rFonts w:ascii="Calibri" w:cs="Calibri" w:eastAsia="Calibri" w:hAnsi="Calibri"/>
+          <w:color w:val="1A1A1A"/>
+          <w:sz w:val="21"/>
+          <w:szCs w:val="21"/>
+        </w:rPr>
+        <w:ptab w:alignment="right" w:relativeTo="margin" w:leader="dot"/>
+      </w:r>
+      <w:r>
+        <w:rPr>
+          <w:rFonts w:ascii="Calibri" w:cs="Calibri" w:eastAsia="Calibri" w:hAnsi="Calibri"/>
+          <w:b/>
+          <w:bCs/>
+          <w:color w:val="1A1A1A"/>
+          <w:sz w:val="21"/>
+          <w:szCs w:val="21"/>
+        </w:rPr>
+        <w:t xml:space="preserve">24</w:t>
+      </w:r>
+    </w:p>
+    <w:p>
+      <w:pPr>
+        <w:spacing w:after="30" w:line="264"/>
+        <w:ind w:left="300"/>
+      </w:pPr>
+      <w:r>
+        <w:rPr>
+          <w:rFonts w:ascii="Calibri" w:cs="Calibri" w:eastAsia="Calibri" w:hAnsi="Calibri"/>
+          <w:b w:val="false"/>
+          <w:bCs w:val="false"/>
+          <w:color w:val="5A6072"/>
+          <w:sz w:val="19"/>
+          <w:szCs w:val="19"/>
+        </w:rPr>
+        <w:t xml:space="preserve">11.1  Unit tests — 85, no database, under one second</w:t>
+      </w:r>
+      <w:r>
+        <w:rPr>
+          <w:rFonts w:ascii="Calibri" w:cs="Calibri" w:eastAsia="Calibri" w:hAnsi="Calibri"/>
+          <w:color w:val="5A6072"/>
+          <w:sz w:val="19"/>
+          <w:szCs w:val="19"/>
+        </w:rPr>
+        <w:ptab w:alignment="right" w:relativeTo="margin" w:leader="dot"/>
+      </w:r>
+      <w:r>
+        <w:rPr>
+          <w:rFonts w:ascii="Calibri" w:cs="Calibri" w:eastAsia="Calibri" w:hAnsi="Calibri"/>
+          <w:b w:val="false"/>
+          <w:bCs w:val="false"/>
+          <w:color w:val="5A6072"/>
+          <w:sz w:val="19"/>
+          <w:szCs w:val="19"/>
+        </w:rPr>
+        <w:t xml:space="preserve">24</w:t>
+      </w:r>
+    </w:p>
+    <w:p>
+      <w:pPr>
+        <w:spacing w:after="30" w:line="264"/>
+        <w:ind w:left="300"/>
+      </w:pPr>
+      <w:r>
+        <w:rPr>
+          <w:rFonts w:ascii="Calibri" w:cs="Calibri" w:eastAsia="Calibri" w:hAnsi="Calibri"/>
+          <w:b w:val="false"/>
+          <w:bCs w:val="false"/>
+          <w:color w:val="5A6072"/>
+          <w:sz w:val="19"/>
+          <w:szCs w:val="19"/>
+        </w:rPr>
+        <w:t xml:space="preserve">11.2  Concurrency tests — the gate</w:t>
+      </w:r>
+      <w:r>
+        <w:rPr>
+          <w:rFonts w:ascii="Calibri" w:cs="Calibri" w:eastAsia="Calibri" w:hAnsi="Calibri"/>
+          <w:color w:val="5A6072"/>
+          <w:sz w:val="19"/>
+          <w:szCs w:val="19"/>
+        </w:rPr>
+        <w:ptab w:alignment="right" w:relativeTo="margin" w:leader="dot"/>
+      </w:r>
+      <w:r>
+        <w:rPr>
+          <w:rFonts w:ascii="Calibri" w:cs="Calibri" w:eastAsia="Calibri" w:hAnsi="Calibri"/>
+          <w:b w:val="false"/>
+          <w:bCs w:val="false"/>
+          <w:color w:val="5A6072"/>
+          <w:sz w:val="19"/>
+          <w:szCs w:val="19"/>
+        </w:rPr>
+        <w:t xml:space="preserve">24</w:t>
+      </w:r>
+    </w:p>
+    <w:p>
+      <w:pPr>
+        <w:spacing w:after="30" w:line="264"/>
+        <w:ind w:left="300"/>
+      </w:pPr>
+      <w:r>
+        <w:rPr>
+          <w:rFonts w:ascii="Calibri" w:cs="Calibri" w:eastAsia="Calibri" w:hAnsi="Calibri"/>
+          <w:b w:val="false"/>
+          <w:bCs w:val="false"/>
+          <w:color w:val="5A6072"/>
+          <w:sz w:val="19"/>
+          <w:szCs w:val="19"/>
+        </w:rPr>
+        <w:t xml:space="preserve">11.3  Defects found by this discipline</w:t>
+      </w:r>
+      <w:r>
+        <w:rPr>
+          <w:rFonts w:ascii="Calibri" w:cs="Calibri" w:eastAsia="Calibri" w:hAnsi="Calibri"/>
+          <w:color w:val="5A6072"/>
+          <w:sz w:val="19"/>
+          <w:szCs w:val="19"/>
+        </w:rPr>
+        <w:ptab w:alignment="right" w:relativeTo="margin" w:leader="dot"/>
+      </w:r>
+      <w:r>
+        <w:rPr>
+          <w:rFonts w:ascii="Calibri" w:cs="Calibri" w:eastAsia="Calibri" w:hAnsi="Calibri"/>
+          <w:b w:val="false"/>
+          <w:bCs w:val="false"/>
+          <w:color w:val="5A6072"/>
+          <w:sz w:val="19"/>
+          <w:szCs w:val="19"/>
+        </w:rPr>
+        <w:t xml:space="preserve">24</w:t>
+      </w:r>
+    </w:p>
+    <w:p>
+      <w:pPr>
+        <w:spacing w:after="60" w:line="264"/>
+        <w:ind w:left="0"/>
+      </w:pPr>
+      <w:r>
+        <w:rPr>
+          <w:rFonts w:ascii="Calibri" w:cs="Calibri" w:eastAsia="Calibri" w:hAnsi="Calibri"/>
+          <w:b/>
+          <w:bCs/>
+          <w:color w:val="1A1A1A"/>
+          <w:sz w:val="21"/>
+          <w:szCs w:val="21"/>
+        </w:rPr>
+        <w:t xml:space="preserve">12.  Running the system</w:t>
+      </w:r>
+      <w:r>
+        <w:rPr>
+          <w:rFonts w:ascii="Calibri" w:cs="Calibri" w:eastAsia="Calibri" w:hAnsi="Calibri"/>
+          <w:color w:val="1A1A1A"/>
+          <w:sz w:val="21"/>
+          <w:szCs w:val="21"/>
+        </w:rPr>
+        <w:ptab w:alignment="right" w:relativeTo="margin" w:leader="dot"/>
+      </w:r>
+      <w:r>
+        <w:rPr>
+          <w:rFonts w:ascii="Calibri" w:cs="Calibri" w:eastAsia="Calibri" w:hAnsi="Calibri"/>
+          <w:b/>
+          <w:bCs/>
+          <w:color w:val="1A1A1A"/>
+          <w:sz w:val="21"/>
+          <w:szCs w:val="21"/>
+        </w:rPr>
+        <w:t xml:space="preserve">26</w:t>
+      </w:r>
+    </w:p>
+    <w:p>
+      <w:pPr>
+        <w:spacing w:after="30" w:line="264"/>
+        <w:ind w:left="300"/>
+      </w:pPr>
+      <w:r>
+        <w:rPr>
+          <w:rFonts w:ascii="Calibri" w:cs="Calibri" w:eastAsia="Calibri" w:hAnsi="Calibri"/>
+          <w:b w:val="false"/>
+          <w:bCs w:val="false"/>
+          <w:color w:val="5A6072"/>
+          <w:sz w:val="19"/>
+          <w:szCs w:val="19"/>
+        </w:rPr>
+        <w:t xml:space="preserve">12.1  One command</w:t>
+      </w:r>
+      <w:r>
+        <w:rPr>
+          <w:rFonts w:ascii="Calibri" w:cs="Calibri" w:eastAsia="Calibri" w:hAnsi="Calibri"/>
+          <w:color w:val="5A6072"/>
+          <w:sz w:val="19"/>
+          <w:szCs w:val="19"/>
+        </w:rPr>
+        <w:ptab w:alignment="right" w:relativeTo="margin" w:leader="dot"/>
+      </w:r>
+      <w:r>
+        <w:rPr>
+          <w:rFonts w:ascii="Calibri" w:cs="Calibri" w:eastAsia="Calibri" w:hAnsi="Calibri"/>
+          <w:b w:val="false"/>
+          <w:bCs w:val="false"/>
+          <w:color w:val="5A6072"/>
+          <w:sz w:val="19"/>
+          <w:szCs w:val="19"/>
+        </w:rPr>
+        <w:t xml:space="preserve">26</w:t>
+      </w:r>
+    </w:p>
+    <w:p>
+      <w:pPr>
+        <w:spacing w:after="30" w:line="264"/>
+        <w:ind w:left="300"/>
+      </w:pPr>
+      <w:r>
+        <w:rPr>
+          <w:rFonts w:ascii="Calibri" w:cs="Calibri" w:eastAsia="Calibri" w:hAnsi="Calibri"/>
+          <w:b w:val="false"/>
+          <w:bCs w:val="false"/>
+          <w:color w:val="5A6072"/>
+          <w:sz w:val="19"/>
+          <w:szCs w:val="19"/>
+        </w:rPr>
+        <w:t xml:space="preserve">12.2  The demonstration</w:t>
+      </w:r>
+      <w:r>
+        <w:rPr>
+          <w:rFonts w:ascii="Calibri" w:cs="Calibri" w:eastAsia="Calibri" w:hAnsi="Calibri"/>
+          <w:color w:val="5A6072"/>
+          <w:sz w:val="19"/>
+          <w:szCs w:val="19"/>
+        </w:rPr>
+        <w:ptab w:alignment="right" w:relativeTo="margin" w:leader="dot"/>
+      </w:r>
+      <w:r>
+        <w:rPr>
+          <w:rFonts w:ascii="Calibri" w:cs="Calibri" w:eastAsia="Calibri" w:hAnsi="Calibri"/>
+          <w:b w:val="false"/>
+          <w:bCs w:val="false"/>
+          <w:color w:val="5A6072"/>
+          <w:sz w:val="19"/>
+          <w:szCs w:val="19"/>
+        </w:rPr>
+        <w:t xml:space="preserve">26</w:t>
+      </w:r>
+    </w:p>
+    <w:p>
+      <w:pPr>
+        <w:spacing w:after="30" w:line="264"/>
+        <w:ind w:left="300"/>
+      </w:pPr>
+      <w:r>
+        <w:rPr>
+          <w:rFonts w:ascii="Calibri" w:cs="Calibri" w:eastAsia="Calibri" w:hAnsi="Calibri"/>
+          <w:b w:val="false"/>
+          <w:bCs w:val="false"/>
+          <w:color w:val="5A6072"/>
+          <w:sz w:val="19"/>
+          <w:szCs w:val="19"/>
+        </w:rPr>
+        <w:t xml:space="preserve">12.3  Verified state</w:t>
+      </w:r>
+      <w:r>
+        <w:rPr>
+          <w:rFonts w:ascii="Calibri" w:cs="Calibri" w:eastAsia="Calibri" w:hAnsi="Calibri"/>
+          <w:color w:val="5A6072"/>
+          <w:sz w:val="19"/>
+          <w:szCs w:val="19"/>
+        </w:rPr>
+        <w:ptab w:alignment="right" w:relativeTo="margin" w:leader="dot"/>
+      </w:r>
+      <w:r>
+        <w:rPr>
+          <w:rFonts w:ascii="Calibri" w:cs="Calibri" w:eastAsia="Calibri" w:hAnsi="Calibri"/>
+          <w:b w:val="false"/>
+          <w:bCs w:val="false"/>
+          <w:color w:val="5A6072"/>
+          <w:sz w:val="19"/>
+          <w:szCs w:val="19"/>
+        </w:rPr>
+        <w:t xml:space="preserve">26</w:t>
+      </w:r>
+    </w:p>
+    <w:p>
+      <w:pPr>
+        <w:spacing w:after="30" w:line="264"/>
+        <w:ind w:left="300"/>
+      </w:pPr>
+      <w:r>
+        <w:rPr>
+          <w:rFonts w:ascii="Calibri" w:cs="Calibri" w:eastAsia="Calibri" w:hAnsi="Calibri"/>
+          <w:b w:val="false"/>
+          <w:bCs w:val="false"/>
+          <w:color w:val="5A6072"/>
+          <w:sz w:val="19"/>
+          <w:szCs w:val="19"/>
+        </w:rPr>
+        <w:t xml:space="preserve">12.4  Where the detail lives</w:t>
+      </w:r>
+      <w:r>
+        <w:rPr>
+          <w:rFonts w:ascii="Calibri" w:cs="Calibri" w:eastAsia="Calibri" w:hAnsi="Calibri"/>
+          <w:color w:val="5A6072"/>
+          <w:sz w:val="19"/>
+          <w:szCs w:val="19"/>
+        </w:rPr>
+        <w:ptab w:alignment="right" w:relativeTo="margin" w:leader="dot"/>
+      </w:r>
+      <w:r>
+        <w:rPr>
+          <w:rFonts w:ascii="Calibri" w:cs="Calibri" w:eastAsia="Calibri" w:hAnsi="Calibri"/>
+          <w:b w:val="false"/>
+          <w:bCs w:val="false"/>
+          <w:color w:val="5A6072"/>
+          <w:sz w:val="19"/>
+          <w:szCs w:val="19"/>
+        </w:rPr>
+        <w:t xml:space="preserve">27</w:t>
       </w:r>
     </w:p>
     <w:p>
@@ -1209,7 +3157,7 @@
       <w:pPr>
         <w:spacing w:after="220" w:line="276"/>
       </w:pPr>
-      <w:hyperlink w:history="1" r:id="rIdvj28jqpkju-zmbfbreuoz">
+      <w:hyperlink w:history="1" r:id="rIdg54biuav5p1u5qz_ws5sj">
         <w:r>
           <w:rPr>
             <w:rFonts w:ascii="Calibri" w:cs="Calibri" w:eastAsia="Calibri" w:hAnsi="Calibri"/>

</xml_diff>